<commit_message>
Page Audit and details
</commit_message>
<xml_diff>
--- a/Phase1_Usability_Audit.docx
+++ b/Phase1_Usability_Audit.docx
@@ -113,7 +113,7 @@
         <w:t>Platform Name:</w:t>
       </w:r>
       <w:r>
-        <w:t xml:space="preserve"> </w:t>
+        <w:t xml:space="preserve"> Intermountain Health MyChart</w:t>
       </w:r>
     </w:p>
     <w:p>
@@ -132,6 +132,15 @@
       </w:r>
       <w:r>
         <w:t xml:space="preserve"> </w:t>
+      </w:r>
+      <w:r>
+        <w:t>Adult humans across the state of Utah</w:t>
+      </w:r>
+      <w:r>
+        <w:t xml:space="preserve"> looking to access the medical history, make future appointments, message their doctor</w:t>
+      </w:r>
+      <w:r>
+        <w:t>, make payments on medical bills.</w:t>
       </w:r>
     </w:p>
     <w:p>
@@ -157,9 +166,45 @@
           <w:numId w:val="3"/>
         </w:numPr>
       </w:pPr>
+      <w:r>
+        <w:t xml:space="preserve">Make Appointments: </w:t>
+      </w:r>
+      <w:r>
+        <w:t>find a primary care doctor/specialist and make an appointment with them.</w:t>
+      </w:r>
     </w:p>
     <w:p>
       <w:pPr>
+        <w:pStyle w:val="ListParagraph"/>
+        <w:numPr>
+          <w:ilvl w:val="0"/>
+          <w:numId w:val="3"/>
+        </w:numPr>
+      </w:pPr>
+      <w:r>
+        <w:t>Message doctors: Have a easy messaging systems to contact patients doctors</w:t>
+      </w:r>
+      <w:r>
+        <w:t xml:space="preserve"> with questions or needing to get prescriptions.</w:t>
+      </w:r>
+    </w:p>
+    <w:p>
+      <w:pPr>
+        <w:pStyle w:val="ListParagraph"/>
+        <w:numPr>
+          <w:ilvl w:val="0"/>
+          <w:numId w:val="3"/>
+        </w:numPr>
+      </w:pPr>
+      <w:r>
+        <w:t>Medical Records: Have a database with users past medical history and</w:t>
+      </w:r>
+      <w:r>
+        <w:t xml:space="preserve"> labs.</w:t>
+      </w:r>
+    </w:p>
+    <w:p>
+      <w:pPr>
         <w:rPr>
           <w:b/>
           <w:bCs/>
@@ -173,7 +218,35 @@
         <w:t>1.2 Problem Statement</w:t>
       </w:r>
     </w:p>
-    <w:p/>
+    <w:p>
+      <w:r>
+        <w:t>The Intermountain Health MyChart</w:t>
+      </w:r>
+      <w:r>
+        <w:t xml:space="preserve"> patient portal is a place for Utahns that use Intermountain Health </w:t>
+      </w:r>
+      <w:r>
+        <w:t xml:space="preserve">for any of their medical needs. Users would be able to </w:t>
+      </w:r>
+      <w:r>
+        <w:t>access their medical history, make appointments, message their doctor directly, or make payments on their medical bills.</w:t>
+      </w:r>
+      <w:r>
+        <w:t xml:space="preserve"> When taking a look at the MyChart portal </w:t>
+      </w:r>
+      <w:r>
+        <w:t xml:space="preserve">UI there are a few UX elements that </w:t>
+      </w:r>
+      <w:r>
+        <w:t>can lead to patient frustration</w:t>
+      </w:r>
+      <w:r>
+        <w:t>, task abandonment</w:t>
+      </w:r>
+      <w:r>
+        <w:t>, and an increased reliance on making phone calls instead of doing the tasks yourself.</w:t>
+      </w:r>
+    </w:p>
     <w:p>
       <w:pPr>
         <w:rPr>
@@ -221,6 +294,12 @@
       <w:r>
         <w:t xml:space="preserve"> </w:t>
       </w:r>
+      <w:r>
+        <w:t>How frequently do you log into you MyChart patent portal</w:t>
+      </w:r>
+      <w:r>
+        <w:t xml:space="preserve"> and what is your main goal for logging on?</w:t>
+      </w:r>
     </w:p>
     <w:p>
       <w:pPr>
@@ -236,6 +315,16 @@
         </w:rPr>
         <w:t>Task 1 (Scheduling</w:t>
       </w:r>
+      <w:r>
+        <w:rPr>
+          <w:b/>
+          <w:bCs/>
+        </w:rPr>
+        <w:t xml:space="preserve">): </w:t>
+      </w:r>
+      <w:r>
+        <w:t>If you needed to make an appointment next week with your primary doctor what steps would you take to do that?</w:t>
+      </w:r>
     </w:p>
     <w:p>
       <w:pPr>
@@ -249,10 +338,34 @@
           <w:b/>
           <w:bCs/>
         </w:rPr>
-        <w:t>Task 2 (Refill):</w:t>
+        <w:lastRenderedPageBreak/>
+        <w:t>Task 2 (</w:t>
+      </w:r>
+      <w:r>
+        <w:rPr>
+          <w:b/>
+          <w:bCs/>
+        </w:rPr>
+        <w:t>Messaging</w:t>
+      </w:r>
+      <w:r>
+        <w:rPr>
+          <w:b/>
+          <w:bCs/>
+        </w:rPr>
+        <w:t>):</w:t>
       </w:r>
       <w:r>
         <w:t xml:space="preserve"> </w:t>
+      </w:r>
+      <w:r>
+        <w:t xml:space="preserve">Say your medicine you are taking </w:t>
+      </w:r>
+      <w:r>
+        <w:t xml:space="preserve">is not enough and you need a higher prescription, how would you go about </w:t>
+      </w:r>
+      <w:r>
+        <w:t>contacting your doctor to increase that?</w:t>
       </w:r>
     </w:p>
     <w:p>
@@ -275,6 +388,12 @@
       </w:r>
       <w:r>
         <w:t xml:space="preserve"> </w:t>
+      </w:r>
+      <w:r>
+        <w:t>If you recently had lab work done at the hospital, how would you find those</w:t>
+      </w:r>
+      <w:r>
+        <w:t xml:space="preserve"> results in the patient portal?</w:t>
       </w:r>
     </w:p>
     <w:p>
@@ -720,7 +839,6 @@
           <w:i/>
           <w:iCs/>
         </w:rPr>
-        <w:lastRenderedPageBreak/>
         <w:t>(Severity Ratings: 0 = None, 1 = Cosmetic, 2 = Minor, 3 = Major, 4 = Catastrophe)</w:t>
       </w:r>
     </w:p>
@@ -737,9 +855,9 @@
         <w:tblLook w:val="04A0" w:firstRow="1" w:lastRow="0" w:firstColumn="1" w:lastColumn="0" w:noHBand="0" w:noVBand="1"/>
       </w:tblPr>
       <w:tblGrid>
-        <w:gridCol w:w="4489"/>
-        <w:gridCol w:w="2987"/>
-        <w:gridCol w:w="1868"/>
+        <w:gridCol w:w="2724"/>
+        <w:gridCol w:w="5169"/>
+        <w:gridCol w:w="1451"/>
       </w:tblGrid>
       <w:tr>
         <w:trPr>
@@ -881,27 +999,41 @@
             <w:vAlign w:val="center"/>
             <w:hideMark/>
           </w:tcPr>
-          <w:p/>
-        </w:tc>
-        <w:tc>
-          <w:tcPr>
-            <w:tcW w:w="0" w:type="auto"/>
-            <w:tcBorders>
-              <w:top w:val="single" w:sz="6" w:space="0" w:color="C4C7C5"/>
-              <w:left w:val="single" w:sz="6" w:space="0" w:color="C4C7C5"/>
-              <w:bottom w:val="single" w:sz="6" w:space="0" w:color="C4C7C5"/>
-              <w:right w:val="single" w:sz="6" w:space="0" w:color="C4C7C5"/>
-            </w:tcBorders>
-            <w:tcMar>
-              <w:top w:w="120" w:type="dxa"/>
-              <w:left w:w="180" w:type="dxa"/>
-              <w:bottom w:w="120" w:type="dxa"/>
-              <w:right w:w="180" w:type="dxa"/>
-            </w:tcMar>
-            <w:vAlign w:val="center"/>
-            <w:hideMark/>
-          </w:tcPr>
-          <w:p/>
+          <w:p>
+            <w:r>
+              <w:t xml:space="preserve">Clicking on </w:t>
+            </w:r>
+            <w:r>
+              <w:t xml:space="preserve">the “Schedule Now” action button pulled up a active loading screen with </w:t>
+            </w:r>
+            <w:r>
+              <w:t>“gathering scheduling options”</w:t>
+            </w:r>
+          </w:p>
+        </w:tc>
+        <w:tc>
+          <w:tcPr>
+            <w:tcW w:w="0" w:type="auto"/>
+            <w:tcBorders>
+              <w:top w:val="single" w:sz="6" w:space="0" w:color="C4C7C5"/>
+              <w:left w:val="single" w:sz="6" w:space="0" w:color="C4C7C5"/>
+              <w:bottom w:val="single" w:sz="6" w:space="0" w:color="C4C7C5"/>
+              <w:right w:val="single" w:sz="6" w:space="0" w:color="C4C7C5"/>
+            </w:tcBorders>
+            <w:tcMar>
+              <w:top w:w="120" w:type="dxa"/>
+              <w:left w:w="180" w:type="dxa"/>
+              <w:bottom w:w="120" w:type="dxa"/>
+              <w:right w:w="180" w:type="dxa"/>
+            </w:tcMar>
+            <w:vAlign w:val="center"/>
+            <w:hideMark/>
+          </w:tcPr>
+          <w:p>
+            <w:r>
+              <w:t>0</w:t>
+            </w:r>
+          </w:p>
         </w:tc>
       </w:tr>
       <w:tr>
@@ -954,27 +1086,38 @@
             <w:vAlign w:val="center"/>
             <w:hideMark/>
           </w:tcPr>
-          <w:p/>
-        </w:tc>
-        <w:tc>
-          <w:tcPr>
-            <w:tcW w:w="0" w:type="auto"/>
-            <w:tcBorders>
-              <w:top w:val="single" w:sz="6" w:space="0" w:color="C4C7C5"/>
-              <w:left w:val="single" w:sz="6" w:space="0" w:color="C4C7C5"/>
-              <w:bottom w:val="single" w:sz="6" w:space="0" w:color="C4C7C5"/>
-              <w:right w:val="single" w:sz="6" w:space="0" w:color="C4C7C5"/>
-            </w:tcBorders>
-            <w:tcMar>
-              <w:top w:w="120" w:type="dxa"/>
-              <w:left w:w="180" w:type="dxa"/>
-              <w:bottom w:w="120" w:type="dxa"/>
-              <w:right w:w="180" w:type="dxa"/>
-            </w:tcMar>
-            <w:vAlign w:val="center"/>
-            <w:hideMark/>
-          </w:tcPr>
-          <w:p/>
+          <w:p>
+            <w:r>
+              <w:t xml:space="preserve">After clicking onto the test results page </w:t>
+            </w:r>
+            <w:r>
+              <w:t>a lot of medical terms for what test have been done show which users would not know what those mean.</w:t>
+            </w:r>
+          </w:p>
+        </w:tc>
+        <w:tc>
+          <w:tcPr>
+            <w:tcW w:w="0" w:type="auto"/>
+            <w:tcBorders>
+              <w:top w:val="single" w:sz="6" w:space="0" w:color="C4C7C5"/>
+              <w:left w:val="single" w:sz="6" w:space="0" w:color="C4C7C5"/>
+              <w:bottom w:val="single" w:sz="6" w:space="0" w:color="C4C7C5"/>
+              <w:right w:val="single" w:sz="6" w:space="0" w:color="C4C7C5"/>
+            </w:tcBorders>
+            <w:tcMar>
+              <w:top w:w="120" w:type="dxa"/>
+              <w:left w:w="180" w:type="dxa"/>
+              <w:bottom w:w="120" w:type="dxa"/>
+              <w:right w:w="180" w:type="dxa"/>
+            </w:tcMar>
+            <w:vAlign w:val="center"/>
+            <w:hideMark/>
+          </w:tcPr>
+          <w:p>
+            <w:r>
+              <w:t>2</w:t>
+            </w:r>
+          </w:p>
         </w:tc>
       </w:tr>
       <w:tr>
@@ -997,6 +1140,201 @@
               <w:right w:w="180" w:type="dxa"/>
             </w:tcMar>
             <w:vAlign w:val="center"/>
+          </w:tcPr>
+          <w:p>
+            <w:pPr>
+              <w:rPr>
+                <w:b/>
+                <w:bCs/>
+              </w:rPr>
+            </w:pPr>
+            <w:r>
+              <w:rPr>
+                <w:b/>
+                <w:bCs/>
+              </w:rPr>
+              <w:t>3.</w:t>
+            </w:r>
+            <w:r>
+              <w:rPr>
+                <w:b/>
+                <w:bCs/>
+              </w:rPr>
+              <w:t xml:space="preserve"> Consistency &amp; Standards</w:t>
+            </w:r>
+          </w:p>
+        </w:tc>
+        <w:tc>
+          <w:tcPr>
+            <w:tcW w:w="0" w:type="auto"/>
+            <w:tcBorders>
+              <w:top w:val="single" w:sz="6" w:space="0" w:color="C4C7C5"/>
+              <w:left w:val="single" w:sz="6" w:space="0" w:color="C4C7C5"/>
+              <w:bottom w:val="single" w:sz="6" w:space="0" w:color="C4C7C5"/>
+              <w:right w:val="single" w:sz="6" w:space="0" w:color="C4C7C5"/>
+            </w:tcBorders>
+            <w:tcMar>
+              <w:top w:w="120" w:type="dxa"/>
+              <w:left w:w="180" w:type="dxa"/>
+              <w:bottom w:w="120" w:type="dxa"/>
+              <w:right w:w="180" w:type="dxa"/>
+            </w:tcMar>
+            <w:vAlign w:val="center"/>
+          </w:tcPr>
+          <w:p>
+            <w:r>
+              <w:t xml:space="preserve">When going through multiple layers </w:t>
+            </w:r>
+            <w:r>
+              <w:t>on the UI in the Update Contact Info page</w:t>
+            </w:r>
+            <w:r>
+              <w:t xml:space="preserve"> the only button that appears to stop is “Discard changes” which does say it will go back but</w:t>
+            </w:r>
+            <w:r>
+              <w:t xml:space="preserve"> most users would imply that</w:t>
+            </w:r>
+          </w:p>
+        </w:tc>
+        <w:tc>
+          <w:tcPr>
+            <w:tcW w:w="0" w:type="auto"/>
+            <w:tcBorders>
+              <w:top w:val="single" w:sz="6" w:space="0" w:color="C4C7C5"/>
+              <w:left w:val="single" w:sz="6" w:space="0" w:color="C4C7C5"/>
+              <w:bottom w:val="single" w:sz="6" w:space="0" w:color="C4C7C5"/>
+              <w:right w:val="single" w:sz="6" w:space="0" w:color="C4C7C5"/>
+            </w:tcBorders>
+            <w:tcMar>
+              <w:top w:w="120" w:type="dxa"/>
+              <w:left w:w="180" w:type="dxa"/>
+              <w:bottom w:w="120" w:type="dxa"/>
+              <w:right w:w="180" w:type="dxa"/>
+            </w:tcMar>
+            <w:vAlign w:val="center"/>
+          </w:tcPr>
+          <w:p>
+            <w:r>
+              <w:t>1</w:t>
+            </w:r>
+          </w:p>
+        </w:tc>
+      </w:tr>
+      <w:tr>
+        <w:trPr>
+          <w:tblCellSpacing w:w="15" w:type="dxa"/>
+        </w:trPr>
+        <w:tc>
+          <w:tcPr>
+            <w:tcW w:w="0" w:type="auto"/>
+            <w:tcBorders>
+              <w:top w:val="single" w:sz="6" w:space="0" w:color="C4C7C5"/>
+              <w:left w:val="single" w:sz="6" w:space="0" w:color="C4C7C5"/>
+              <w:bottom w:val="single" w:sz="6" w:space="0" w:color="C4C7C5"/>
+              <w:right w:val="single" w:sz="6" w:space="0" w:color="C4C7C5"/>
+            </w:tcBorders>
+            <w:tcMar>
+              <w:top w:w="120" w:type="dxa"/>
+              <w:left w:w="180" w:type="dxa"/>
+              <w:bottom w:w="120" w:type="dxa"/>
+              <w:right w:w="180" w:type="dxa"/>
+            </w:tcMar>
+            <w:vAlign w:val="center"/>
+          </w:tcPr>
+          <w:p>
+            <w:pPr>
+              <w:rPr>
+                <w:b/>
+                <w:bCs/>
+              </w:rPr>
+            </w:pPr>
+            <w:r>
+              <w:rPr>
+                <w:b/>
+                <w:bCs/>
+              </w:rPr>
+              <w:lastRenderedPageBreak/>
+              <w:t>4.</w:t>
+            </w:r>
+            <w:r>
+              <w:rPr>
+                <w:b/>
+                <w:bCs/>
+              </w:rPr>
+              <w:t xml:space="preserve"> Error Prevention</w:t>
+            </w:r>
+          </w:p>
+        </w:tc>
+        <w:tc>
+          <w:tcPr>
+            <w:tcW w:w="0" w:type="auto"/>
+            <w:tcBorders>
+              <w:top w:val="single" w:sz="6" w:space="0" w:color="C4C7C5"/>
+              <w:left w:val="single" w:sz="6" w:space="0" w:color="C4C7C5"/>
+              <w:bottom w:val="single" w:sz="6" w:space="0" w:color="C4C7C5"/>
+              <w:right w:val="single" w:sz="6" w:space="0" w:color="C4C7C5"/>
+            </w:tcBorders>
+            <w:tcMar>
+              <w:top w:w="120" w:type="dxa"/>
+              <w:left w:w="180" w:type="dxa"/>
+              <w:bottom w:w="120" w:type="dxa"/>
+              <w:right w:w="180" w:type="dxa"/>
+            </w:tcMar>
+            <w:vAlign w:val="center"/>
+          </w:tcPr>
+          <w:p>
+            <w:r>
+              <w:t xml:space="preserve">When going to different pages on the website </w:t>
+            </w:r>
+            <w:r>
+              <w:t>the layout stays with the top bar format being the same and predictable</w:t>
+            </w:r>
+          </w:p>
+        </w:tc>
+        <w:tc>
+          <w:tcPr>
+            <w:tcW w:w="0" w:type="auto"/>
+            <w:tcBorders>
+              <w:top w:val="single" w:sz="6" w:space="0" w:color="C4C7C5"/>
+              <w:left w:val="single" w:sz="6" w:space="0" w:color="C4C7C5"/>
+              <w:bottom w:val="single" w:sz="6" w:space="0" w:color="C4C7C5"/>
+              <w:right w:val="single" w:sz="6" w:space="0" w:color="C4C7C5"/>
+            </w:tcBorders>
+            <w:tcMar>
+              <w:top w:w="120" w:type="dxa"/>
+              <w:left w:w="180" w:type="dxa"/>
+              <w:bottom w:w="120" w:type="dxa"/>
+              <w:right w:w="180" w:type="dxa"/>
+            </w:tcMar>
+            <w:vAlign w:val="center"/>
+          </w:tcPr>
+          <w:p>
+            <w:r>
+              <w:t>0</w:t>
+            </w:r>
+          </w:p>
+        </w:tc>
+      </w:tr>
+      <w:tr>
+        <w:trPr>
+          <w:tblCellSpacing w:w="15" w:type="dxa"/>
+        </w:trPr>
+        <w:tc>
+          <w:tcPr>
+            <w:tcW w:w="0" w:type="auto"/>
+            <w:tcBorders>
+              <w:top w:val="single" w:sz="6" w:space="0" w:color="C4C7C5"/>
+              <w:left w:val="single" w:sz="6" w:space="0" w:color="C4C7C5"/>
+              <w:bottom w:val="single" w:sz="6" w:space="0" w:color="C4C7C5"/>
+              <w:right w:val="single" w:sz="6" w:space="0" w:color="C4C7C5"/>
+            </w:tcBorders>
+            <w:tcMar>
+              <w:top w:w="120" w:type="dxa"/>
+              <w:left w:w="180" w:type="dxa"/>
+              <w:bottom w:w="120" w:type="dxa"/>
+              <w:right w:w="180" w:type="dxa"/>
+            </w:tcMar>
+            <w:vAlign w:val="center"/>
             <w:hideMark/>
           </w:tcPr>
           <w:p>
@@ -1027,27 +1365,41 @@
             <w:vAlign w:val="center"/>
             <w:hideMark/>
           </w:tcPr>
-          <w:p/>
-        </w:tc>
-        <w:tc>
-          <w:tcPr>
-            <w:tcW w:w="0" w:type="auto"/>
-            <w:tcBorders>
-              <w:top w:val="single" w:sz="6" w:space="0" w:color="C4C7C5"/>
-              <w:left w:val="single" w:sz="6" w:space="0" w:color="C4C7C5"/>
-              <w:bottom w:val="single" w:sz="6" w:space="0" w:color="C4C7C5"/>
-              <w:right w:val="single" w:sz="6" w:space="0" w:color="C4C7C5"/>
-            </w:tcBorders>
-            <w:tcMar>
-              <w:top w:w="120" w:type="dxa"/>
-              <w:left w:w="180" w:type="dxa"/>
-              <w:bottom w:w="120" w:type="dxa"/>
-              <w:right w:w="180" w:type="dxa"/>
-            </w:tcMar>
-            <w:vAlign w:val="center"/>
-            <w:hideMark/>
-          </w:tcPr>
-          <w:p/>
+          <w:p>
+            <w:r>
+              <w:t xml:space="preserve">After testing the </w:t>
+            </w:r>
+            <w:r>
+              <w:t xml:space="preserve">personal information and changing details about me there was no error prevention </w:t>
+            </w:r>
+            <w:r>
+              <w:t>to stop me from making a mistake</w:t>
+            </w:r>
+          </w:p>
+        </w:tc>
+        <w:tc>
+          <w:tcPr>
+            <w:tcW w:w="0" w:type="auto"/>
+            <w:tcBorders>
+              <w:top w:val="single" w:sz="6" w:space="0" w:color="C4C7C5"/>
+              <w:left w:val="single" w:sz="6" w:space="0" w:color="C4C7C5"/>
+              <w:bottom w:val="single" w:sz="6" w:space="0" w:color="C4C7C5"/>
+              <w:right w:val="single" w:sz="6" w:space="0" w:color="C4C7C5"/>
+            </w:tcBorders>
+            <w:tcMar>
+              <w:top w:w="120" w:type="dxa"/>
+              <w:left w:w="180" w:type="dxa"/>
+              <w:bottom w:w="120" w:type="dxa"/>
+              <w:right w:w="180" w:type="dxa"/>
+            </w:tcMar>
+            <w:vAlign w:val="center"/>
+            <w:hideMark/>
+          </w:tcPr>
+          <w:p>
+            <w:r>
+              <w:t>3</w:t>
+            </w:r>
+          </w:p>
         </w:tc>
       </w:tr>
       <w:tr>
@@ -1100,27 +1452,35 @@
             <w:vAlign w:val="center"/>
             <w:hideMark/>
           </w:tcPr>
-          <w:p/>
-        </w:tc>
-        <w:tc>
-          <w:tcPr>
-            <w:tcW w:w="0" w:type="auto"/>
-            <w:tcBorders>
-              <w:top w:val="single" w:sz="6" w:space="0" w:color="C4C7C5"/>
-              <w:left w:val="single" w:sz="6" w:space="0" w:color="C4C7C5"/>
-              <w:bottom w:val="single" w:sz="6" w:space="0" w:color="C4C7C5"/>
-              <w:right w:val="single" w:sz="6" w:space="0" w:color="C4C7C5"/>
-            </w:tcBorders>
-            <w:tcMar>
-              <w:top w:w="120" w:type="dxa"/>
-              <w:left w:w="180" w:type="dxa"/>
-              <w:bottom w:w="120" w:type="dxa"/>
-              <w:right w:w="180" w:type="dxa"/>
-            </w:tcMar>
-            <w:vAlign w:val="center"/>
-            <w:hideMark/>
-          </w:tcPr>
-          <w:p/>
+          <w:p>
+            <w:r>
+              <w:t>The system does not use any recognition of things that might have been input on one screen from another so users would have to recall from their memory</w:t>
+            </w:r>
+          </w:p>
+        </w:tc>
+        <w:tc>
+          <w:tcPr>
+            <w:tcW w:w="0" w:type="auto"/>
+            <w:tcBorders>
+              <w:top w:val="single" w:sz="6" w:space="0" w:color="C4C7C5"/>
+              <w:left w:val="single" w:sz="6" w:space="0" w:color="C4C7C5"/>
+              <w:bottom w:val="single" w:sz="6" w:space="0" w:color="C4C7C5"/>
+              <w:right w:val="single" w:sz="6" w:space="0" w:color="C4C7C5"/>
+            </w:tcBorders>
+            <w:tcMar>
+              <w:top w:w="120" w:type="dxa"/>
+              <w:left w:w="180" w:type="dxa"/>
+              <w:bottom w:w="120" w:type="dxa"/>
+              <w:right w:w="180" w:type="dxa"/>
+            </w:tcMar>
+            <w:vAlign w:val="center"/>
+            <w:hideMark/>
+          </w:tcPr>
+          <w:p>
+            <w:r>
+              <w:t>3</w:t>
+            </w:r>
+          </w:p>
         </w:tc>
       </w:tr>
       <w:tr>
@@ -1143,6 +1503,201 @@
               <w:right w:w="180" w:type="dxa"/>
             </w:tcMar>
             <w:vAlign w:val="center"/>
+          </w:tcPr>
+          <w:p>
+            <w:pPr>
+              <w:rPr>
+                <w:b/>
+                <w:bCs/>
+              </w:rPr>
+            </w:pPr>
+            <w:r>
+              <w:rPr>
+                <w:b/>
+                <w:bCs/>
+              </w:rPr>
+              <w:t>7.</w:t>
+            </w:r>
+            <w:r>
+              <w:rPr>
+                <w:b/>
+                <w:bCs/>
+              </w:rPr>
+              <w:t xml:space="preserve"> </w:t>
+            </w:r>
+            <w:r>
+              <w:rPr>
+                <w:b/>
+                <w:bCs/>
+              </w:rPr>
+              <w:t>Flexibility &amp; Efficiency of Use</w:t>
+            </w:r>
+          </w:p>
+        </w:tc>
+        <w:tc>
+          <w:tcPr>
+            <w:tcW w:w="0" w:type="auto"/>
+            <w:tcBorders>
+              <w:top w:val="single" w:sz="6" w:space="0" w:color="C4C7C5"/>
+              <w:left w:val="single" w:sz="6" w:space="0" w:color="C4C7C5"/>
+              <w:bottom w:val="single" w:sz="6" w:space="0" w:color="C4C7C5"/>
+              <w:right w:val="single" w:sz="6" w:space="0" w:color="C4C7C5"/>
+            </w:tcBorders>
+            <w:tcMar>
+              <w:top w:w="120" w:type="dxa"/>
+              <w:left w:w="180" w:type="dxa"/>
+              <w:bottom w:w="120" w:type="dxa"/>
+              <w:right w:w="180" w:type="dxa"/>
+            </w:tcMar>
+            <w:vAlign w:val="center"/>
+          </w:tcPr>
+          <w:p>
+            <w:r>
+              <w:t>There is some customization ability that can be done on the main page by pinning your 6 most used items, but only six no more and no less.</w:t>
+            </w:r>
+          </w:p>
+        </w:tc>
+        <w:tc>
+          <w:tcPr>
+            <w:tcW w:w="0" w:type="auto"/>
+            <w:tcBorders>
+              <w:top w:val="single" w:sz="6" w:space="0" w:color="C4C7C5"/>
+              <w:left w:val="single" w:sz="6" w:space="0" w:color="C4C7C5"/>
+              <w:bottom w:val="single" w:sz="6" w:space="0" w:color="C4C7C5"/>
+              <w:right w:val="single" w:sz="6" w:space="0" w:color="C4C7C5"/>
+            </w:tcBorders>
+            <w:tcMar>
+              <w:top w:w="120" w:type="dxa"/>
+              <w:left w:w="180" w:type="dxa"/>
+              <w:bottom w:w="120" w:type="dxa"/>
+              <w:right w:w="180" w:type="dxa"/>
+            </w:tcMar>
+            <w:vAlign w:val="center"/>
+          </w:tcPr>
+          <w:p>
+            <w:r>
+              <w:t>2</w:t>
+            </w:r>
+          </w:p>
+        </w:tc>
+      </w:tr>
+      <w:tr>
+        <w:trPr>
+          <w:tblCellSpacing w:w="15" w:type="dxa"/>
+        </w:trPr>
+        <w:tc>
+          <w:tcPr>
+            <w:tcW w:w="0" w:type="auto"/>
+            <w:tcBorders>
+              <w:top w:val="single" w:sz="6" w:space="0" w:color="C4C7C5"/>
+              <w:left w:val="single" w:sz="6" w:space="0" w:color="C4C7C5"/>
+              <w:bottom w:val="single" w:sz="6" w:space="0" w:color="C4C7C5"/>
+              <w:right w:val="single" w:sz="6" w:space="0" w:color="C4C7C5"/>
+            </w:tcBorders>
+            <w:tcMar>
+              <w:top w:w="120" w:type="dxa"/>
+              <w:left w:w="180" w:type="dxa"/>
+              <w:bottom w:w="120" w:type="dxa"/>
+              <w:right w:w="180" w:type="dxa"/>
+            </w:tcMar>
+            <w:vAlign w:val="center"/>
+          </w:tcPr>
+          <w:p>
+            <w:pPr>
+              <w:rPr>
+                <w:b/>
+                <w:bCs/>
+              </w:rPr>
+            </w:pPr>
+            <w:r>
+              <w:rPr>
+                <w:b/>
+                <w:bCs/>
+              </w:rPr>
+              <w:t>8.</w:t>
+            </w:r>
+            <w:r>
+              <w:rPr>
+                <w:b/>
+                <w:bCs/>
+              </w:rPr>
+              <w:t xml:space="preserve"> Aesthetic &amp; Minimalist Design</w:t>
+            </w:r>
+          </w:p>
+        </w:tc>
+        <w:tc>
+          <w:tcPr>
+            <w:tcW w:w="0" w:type="auto"/>
+            <w:tcBorders>
+              <w:top w:val="single" w:sz="6" w:space="0" w:color="C4C7C5"/>
+              <w:left w:val="single" w:sz="6" w:space="0" w:color="C4C7C5"/>
+              <w:bottom w:val="single" w:sz="6" w:space="0" w:color="C4C7C5"/>
+              <w:right w:val="single" w:sz="6" w:space="0" w:color="C4C7C5"/>
+            </w:tcBorders>
+            <w:tcMar>
+              <w:top w:w="120" w:type="dxa"/>
+              <w:left w:w="180" w:type="dxa"/>
+              <w:bottom w:w="120" w:type="dxa"/>
+              <w:right w:w="180" w:type="dxa"/>
+            </w:tcMar>
+            <w:vAlign w:val="center"/>
+          </w:tcPr>
+          <w:p>
+            <w:r>
+              <w:t xml:space="preserve">The overall design has minimal </w:t>
+            </w:r>
+            <w:r>
+              <w:t xml:space="preserve">clutter but some elements pop more than others like the “Your Updates” section takes away from the top 6 </w:t>
+            </w:r>
+            <w:r>
+              <w:t>pages above it with those being smaller</w:t>
+            </w:r>
+          </w:p>
+        </w:tc>
+        <w:tc>
+          <w:tcPr>
+            <w:tcW w:w="0" w:type="auto"/>
+            <w:tcBorders>
+              <w:top w:val="single" w:sz="6" w:space="0" w:color="C4C7C5"/>
+              <w:left w:val="single" w:sz="6" w:space="0" w:color="C4C7C5"/>
+              <w:bottom w:val="single" w:sz="6" w:space="0" w:color="C4C7C5"/>
+              <w:right w:val="single" w:sz="6" w:space="0" w:color="C4C7C5"/>
+            </w:tcBorders>
+            <w:tcMar>
+              <w:top w:w="120" w:type="dxa"/>
+              <w:left w:w="180" w:type="dxa"/>
+              <w:bottom w:w="120" w:type="dxa"/>
+              <w:right w:w="180" w:type="dxa"/>
+            </w:tcMar>
+            <w:vAlign w:val="center"/>
+          </w:tcPr>
+          <w:p>
+            <w:r>
+              <w:t>1</w:t>
+            </w:r>
+          </w:p>
+        </w:tc>
+      </w:tr>
+      <w:tr>
+        <w:trPr>
+          <w:tblCellSpacing w:w="15" w:type="dxa"/>
+        </w:trPr>
+        <w:tc>
+          <w:tcPr>
+            <w:tcW w:w="0" w:type="auto"/>
+            <w:tcBorders>
+              <w:top w:val="single" w:sz="6" w:space="0" w:color="C4C7C5"/>
+              <w:left w:val="single" w:sz="6" w:space="0" w:color="C4C7C5"/>
+              <w:bottom w:val="single" w:sz="6" w:space="0" w:color="C4C7C5"/>
+              <w:right w:val="single" w:sz="6" w:space="0" w:color="C4C7C5"/>
+            </w:tcBorders>
+            <w:tcMar>
+              <w:top w:w="120" w:type="dxa"/>
+              <w:left w:w="180" w:type="dxa"/>
+              <w:bottom w:w="120" w:type="dxa"/>
+              <w:right w:w="180" w:type="dxa"/>
+            </w:tcMar>
+            <w:vAlign w:val="center"/>
             <w:hideMark/>
           </w:tcPr>
           <w:p>
@@ -1173,27 +1728,134 @@
             <w:vAlign w:val="center"/>
             <w:hideMark/>
           </w:tcPr>
-          <w:p/>
-        </w:tc>
-        <w:tc>
-          <w:tcPr>
-            <w:tcW w:w="0" w:type="auto"/>
-            <w:tcBorders>
-              <w:top w:val="single" w:sz="6" w:space="0" w:color="C4C7C5"/>
-              <w:left w:val="single" w:sz="6" w:space="0" w:color="C4C7C5"/>
-              <w:bottom w:val="single" w:sz="6" w:space="0" w:color="C4C7C5"/>
-              <w:right w:val="single" w:sz="6" w:space="0" w:color="C4C7C5"/>
-            </w:tcBorders>
-            <w:tcMar>
-              <w:top w:w="120" w:type="dxa"/>
-              <w:left w:w="180" w:type="dxa"/>
-              <w:bottom w:w="120" w:type="dxa"/>
-              <w:right w:w="180" w:type="dxa"/>
-            </w:tcMar>
-            <w:vAlign w:val="center"/>
-            <w:hideMark/>
-          </w:tcPr>
-          <w:p/>
+          <w:p>
+            <w:r>
+              <w:t>When waiting for the session expired a popup showed up showing that the user would be logged out and have to log back in</w:t>
+            </w:r>
+          </w:p>
+        </w:tc>
+        <w:tc>
+          <w:tcPr>
+            <w:tcW w:w="0" w:type="auto"/>
+            <w:tcBorders>
+              <w:top w:val="single" w:sz="6" w:space="0" w:color="C4C7C5"/>
+              <w:left w:val="single" w:sz="6" w:space="0" w:color="C4C7C5"/>
+              <w:bottom w:val="single" w:sz="6" w:space="0" w:color="C4C7C5"/>
+              <w:right w:val="single" w:sz="6" w:space="0" w:color="C4C7C5"/>
+            </w:tcBorders>
+            <w:tcMar>
+              <w:top w:w="120" w:type="dxa"/>
+              <w:left w:w="180" w:type="dxa"/>
+              <w:bottom w:w="120" w:type="dxa"/>
+              <w:right w:w="180" w:type="dxa"/>
+            </w:tcMar>
+            <w:vAlign w:val="center"/>
+            <w:hideMark/>
+          </w:tcPr>
+          <w:p>
+            <w:r>
+              <w:t>0</w:t>
+            </w:r>
+          </w:p>
+        </w:tc>
+      </w:tr>
+      <w:tr>
+        <w:trPr>
+          <w:tblCellSpacing w:w="15" w:type="dxa"/>
+        </w:trPr>
+        <w:tc>
+          <w:tcPr>
+            <w:tcW w:w="0" w:type="auto"/>
+            <w:tcBorders>
+              <w:top w:val="single" w:sz="6" w:space="0" w:color="C4C7C5"/>
+              <w:left w:val="single" w:sz="6" w:space="0" w:color="C4C7C5"/>
+              <w:bottom w:val="single" w:sz="6" w:space="0" w:color="C4C7C5"/>
+              <w:right w:val="single" w:sz="6" w:space="0" w:color="C4C7C5"/>
+            </w:tcBorders>
+            <w:tcMar>
+              <w:top w:w="120" w:type="dxa"/>
+              <w:left w:w="180" w:type="dxa"/>
+              <w:bottom w:w="120" w:type="dxa"/>
+              <w:right w:w="180" w:type="dxa"/>
+            </w:tcMar>
+            <w:vAlign w:val="center"/>
+          </w:tcPr>
+          <w:p>
+            <w:pPr>
+              <w:rPr>
+                <w:b/>
+                <w:bCs/>
+              </w:rPr>
+            </w:pPr>
+            <w:r>
+              <w:rPr>
+                <w:b/>
+                <w:bCs/>
+              </w:rPr>
+              <w:t>10.</w:t>
+            </w:r>
+            <w:r>
+              <w:rPr>
+                <w:b/>
+                <w:bCs/>
+              </w:rPr>
+              <w:t xml:space="preserve"> Help &amp; Documentation</w:t>
+            </w:r>
+          </w:p>
+        </w:tc>
+        <w:tc>
+          <w:tcPr>
+            <w:tcW w:w="0" w:type="auto"/>
+            <w:tcBorders>
+              <w:top w:val="single" w:sz="6" w:space="0" w:color="C4C7C5"/>
+              <w:left w:val="single" w:sz="6" w:space="0" w:color="C4C7C5"/>
+              <w:bottom w:val="single" w:sz="6" w:space="0" w:color="C4C7C5"/>
+              <w:right w:val="single" w:sz="6" w:space="0" w:color="C4C7C5"/>
+            </w:tcBorders>
+            <w:tcMar>
+              <w:top w:w="120" w:type="dxa"/>
+              <w:left w:w="180" w:type="dxa"/>
+              <w:bottom w:w="120" w:type="dxa"/>
+              <w:right w:w="180" w:type="dxa"/>
+            </w:tcMar>
+            <w:vAlign w:val="center"/>
+          </w:tcPr>
+          <w:p>
+            <w:r>
+              <w:t xml:space="preserve">When users get stuck there is a small chat box in the bottom righthand corner but it just shows a logo of Intermountain Health and </w:t>
+            </w:r>
+            <w:r>
+              <w:lastRenderedPageBreak/>
+              <w:t xml:space="preserve">nothing about </w:t>
+            </w:r>
+            <w:r>
+              <w:t>“help”, but when clicking on it, it asks how it can help</w:t>
+            </w:r>
+          </w:p>
+        </w:tc>
+        <w:tc>
+          <w:tcPr>
+            <w:tcW w:w="0" w:type="auto"/>
+            <w:tcBorders>
+              <w:top w:val="single" w:sz="6" w:space="0" w:color="C4C7C5"/>
+              <w:left w:val="single" w:sz="6" w:space="0" w:color="C4C7C5"/>
+              <w:bottom w:val="single" w:sz="6" w:space="0" w:color="C4C7C5"/>
+              <w:right w:val="single" w:sz="6" w:space="0" w:color="C4C7C5"/>
+            </w:tcBorders>
+            <w:tcMar>
+              <w:top w:w="120" w:type="dxa"/>
+              <w:left w:w="180" w:type="dxa"/>
+              <w:bottom w:w="120" w:type="dxa"/>
+              <w:right w:w="180" w:type="dxa"/>
+            </w:tcMar>
+            <w:vAlign w:val="center"/>
+          </w:tcPr>
+          <w:p>
+            <w:r>
+              <w:lastRenderedPageBreak/>
+              <w:t>1</w:t>
+            </w:r>
+          </w:p>
         </w:tc>
       </w:tr>
     </w:tbl>
@@ -1225,9 +1887,9 @@
         <w:tblLook w:val="04A0" w:firstRow="1" w:lastRow="0" w:firstColumn="1" w:lastColumn="0" w:noHBand="0" w:noVBand="1"/>
       </w:tblPr>
       <w:tblGrid>
-        <w:gridCol w:w="3530"/>
-        <w:gridCol w:w="3306"/>
-        <w:gridCol w:w="2508"/>
+        <w:gridCol w:w="4309"/>
+        <w:gridCol w:w="2779"/>
+        <w:gridCol w:w="2256"/>
       </w:tblGrid>
       <w:tr>
         <w:trPr>
@@ -1485,15 +2147,91 @@
               <w:right w:w="180" w:type="dxa"/>
             </w:tcMar>
             <w:vAlign w:val="center"/>
-            <w:hideMark/>
-          </w:tcPr>
-          <w:p>
-            <w:r>
+          </w:tcPr>
+          <w:p>
+            <w:pPr>
               <w:rPr>
                 <w:b/>
                 <w:bCs/>
               </w:rPr>
-              <w:t>SC 1.3.1 Info &amp; Relationships</w:t>
+            </w:pPr>
+            <w:r>
+              <w:rPr>
+                <w:b/>
+                <w:bCs/>
+              </w:rPr>
+              <w:t>SC 2.4.4 / 4.1.2 Link Purpose &amp; Accessible Names</w:t>
+            </w:r>
+          </w:p>
+        </w:tc>
+        <w:tc>
+          <w:tcPr>
+            <w:tcW w:w="0" w:type="auto"/>
+            <w:tcBorders>
+              <w:top w:val="single" w:sz="6" w:space="0" w:color="C4C7C5"/>
+              <w:left w:val="single" w:sz="6" w:space="0" w:color="C4C7C5"/>
+              <w:bottom w:val="single" w:sz="6" w:space="0" w:color="C4C7C5"/>
+              <w:right w:val="single" w:sz="6" w:space="0" w:color="C4C7C5"/>
+            </w:tcBorders>
+            <w:tcMar>
+              <w:top w:w="120" w:type="dxa"/>
+              <w:left w:w="180" w:type="dxa"/>
+              <w:bottom w:w="120" w:type="dxa"/>
+              <w:right w:w="180" w:type="dxa"/>
+            </w:tcMar>
+            <w:vAlign w:val="center"/>
+          </w:tcPr>
+          <w:p/>
+        </w:tc>
+        <w:tc>
+          <w:tcPr>
+            <w:tcW w:w="0" w:type="auto"/>
+            <w:tcBorders>
+              <w:top w:val="single" w:sz="6" w:space="0" w:color="C4C7C5"/>
+              <w:left w:val="single" w:sz="6" w:space="0" w:color="C4C7C5"/>
+              <w:bottom w:val="single" w:sz="6" w:space="0" w:color="C4C7C5"/>
+              <w:right w:val="single" w:sz="6" w:space="0" w:color="C4C7C5"/>
+            </w:tcBorders>
+            <w:tcMar>
+              <w:top w:w="120" w:type="dxa"/>
+              <w:left w:w="180" w:type="dxa"/>
+              <w:bottom w:w="120" w:type="dxa"/>
+              <w:right w:w="180" w:type="dxa"/>
+            </w:tcMar>
+            <w:vAlign w:val="center"/>
+          </w:tcPr>
+          <w:p/>
+        </w:tc>
+      </w:tr>
+      <w:tr>
+        <w:trPr>
+          <w:tblCellSpacing w:w="15" w:type="dxa"/>
+        </w:trPr>
+        <w:tc>
+          <w:tcPr>
+            <w:tcW w:w="0" w:type="auto"/>
+            <w:tcBorders>
+              <w:top w:val="single" w:sz="6" w:space="0" w:color="C4C7C5"/>
+              <w:left w:val="single" w:sz="6" w:space="0" w:color="C4C7C5"/>
+              <w:bottom w:val="single" w:sz="6" w:space="0" w:color="C4C7C5"/>
+              <w:right w:val="single" w:sz="6" w:space="0" w:color="C4C7C5"/>
+            </w:tcBorders>
+            <w:tcMar>
+              <w:top w:w="120" w:type="dxa"/>
+              <w:left w:w="180" w:type="dxa"/>
+              <w:bottom w:w="120" w:type="dxa"/>
+              <w:right w:w="180" w:type="dxa"/>
+            </w:tcMar>
+            <w:vAlign w:val="center"/>
+            <w:hideMark/>
+          </w:tcPr>
+          <w:p>
+            <w:r>
+              <w:rPr>
+                <w:b/>
+                <w:bCs/>
+              </w:rPr>
+              <w:t>SC 2.5.5 / 2.5.8 Touch Target Size &amp; Spacing</w:t>
             </w:r>
           </w:p>
         </w:tc>
@@ -1606,7 +2344,6 @@
           <w:i/>
           <w:iCs/>
         </w:rPr>
-        <w:lastRenderedPageBreak/>
         <w:t xml:space="preserve">Generative AI </w:t>
       </w:r>
       <w:r>
@@ -2644,6 +3381,7 @@
   <w:style w:type="character" w:default="1" w:styleId="DefaultParagraphFont">
     <w:name w:val="Default Paragraph Font"/>
     <w:uiPriority w:val="1"/>
+    <w:semiHidden/>
     <w:unhideWhenUsed/>
   </w:style>
   <w:style w:type="table" w:default="1" w:styleId="TableNormal">

</xml_diff>